<commit_message>
[feature] proposal fix p.2
</commit_message>
<xml_diff>
--- a/proyek/arb-02/Proposal_AntechAsync_SIGAP.docx
+++ b/proyek/arb-02/Proposal_AntechAsync_SIGAP.docx
@@ -658,7 +658,7 @@
         <w:rPr>
           <w:rFonts w:ascii="Tahoma" w:hAnsi="Tahoma" w:cs="Tahoma" w:eastAsia="Tahoma"/>
         </w:rPr>
-        <w:t xml:space="preserve">Purwo Setiawan</w:t>
+        <w:t xml:space="preserve">Purwo Setiawan, S.T., M.Sc</w:t>
       </w:r>
     </w:p>
     <w:p>
@@ -681,9 +681,8 @@
       <w:r>
         <w:rPr>
           <w:rFonts w:ascii="Tahoma" w:hAnsi="Tahoma" w:cs="Tahoma" w:eastAsia="Tahoma"/>
-          <w:highlight w:val="yellow"/>
-        </w:rPr>
-        <w:t>[L / P]</w:t>
+        </w:rPr>
+        <w:t xml:space="preserve">L</w:t>
       </w:r>
     </w:p>
     <w:p>
@@ -731,9 +730,8 @@
       <w:r>
         <w:rPr>
           <w:rFonts w:ascii="Tahoma" w:hAnsi="Tahoma" w:cs="Tahoma" w:eastAsia="Tahoma"/>
-          <w:highlight w:val="yellow"/>
-        </w:rPr>
-        <w:t xml:space="preserve">[NIDN/NUPTK]</w:t>
+        </w:rPr>
+        <w:t xml:space="preserve">0619019802</w:t>
       </w:r>
     </w:p>
     <w:p>
@@ -756,9 +754,8 @@
       <w:r>
         <w:rPr>
           <w:rFonts w:ascii="Tahoma" w:hAnsi="Tahoma" w:cs="Tahoma" w:eastAsia="Tahoma"/>
-          <w:highlight w:val="yellow"/>
-        </w:rPr>
-        <w:t>[Jabatan, jika ada]</w:t>
+        </w:rPr>
+        <w:t xml:space="preserve">-</w:t>
       </w:r>
     </w:p>
     <w:p>
@@ -781,9 +778,8 @@
       <w:r>
         <w:rPr>
           <w:rFonts w:ascii="Tahoma" w:hAnsi="Tahoma" w:cs="Tahoma" w:eastAsia="Tahoma"/>
-          <w:highlight w:val="yellow"/>
-        </w:rPr>
-        <w:t>[Jabatan, jika ada]</w:t>
+        </w:rPr>
+        <w:t xml:space="preserve">Asisten Ahli</w:t>
       </w:r>
     </w:p>
     <w:p>
@@ -807,9 +803,8 @@
       <w:r>
         <w:rPr>
           <w:rFonts w:ascii="Tahoma" w:hAnsi="Tahoma" w:cs="Tahoma" w:eastAsia="Tahoma"/>
-          <w:highlight w:val="yellow"/>
-        </w:rPr>
-        <w:t>[Nama institusi]</w:t>
+        </w:rPr>
+        <w:t xml:space="preserve">Universitas Muhammadiyah Surakarta</w:t>
       </w:r>
     </w:p>
     <w:p>
@@ -832,9 +827,8 @@
       <w:r>
         <w:rPr>
           <w:rFonts w:ascii="Tahoma" w:hAnsi="Tahoma" w:cs="Tahoma" w:eastAsia="Tahoma"/>
-          <w:highlight w:val="yellow"/>
-        </w:rPr>
-        <w:t>[Alamat institusi]</w:t>
+        </w:rPr>
+        <w:t xml:space="preserve">Jl. A. Yani, Mendungan, Pabelan, Kec. Kartasura, Kabupaten Sukoharjo, Jawa Tengah 57169</w:t>
       </w:r>
     </w:p>
     <w:p>
@@ -857,9 +851,8 @@
       <w:r>
         <w:rPr>
           <w:rFonts w:ascii="Tahoma" w:hAnsi="Tahoma" w:cs="Tahoma" w:eastAsia="Tahoma"/>
-          <w:highlight w:val="yellow"/>
-        </w:rPr>
-        <w:t>[Alamat, jika diperlukan]</w:t>
+        </w:rPr>
+        <w:t xml:space="preserve">-</w:t>
       </w:r>
     </w:p>
     <w:p>
@@ -908,9 +901,8 @@
       <w:r>
         <w:rPr>
           <w:rFonts w:ascii="Tahoma" w:hAnsi="Tahoma" w:cs="Tahoma" w:eastAsia="Tahoma"/>
-          <w:highlight w:val="yellow"/>
-        </w:rPr>
-        <w:t>[Email aktif]</w:t>
+        </w:rPr>
+        <w:t xml:space="preserve">ps839@ums.ac.id</w:t>
       </w:r>
     </w:p>
     <w:p>
@@ -1248,7 +1240,7 @@
               <w:rPr>
                 <w:rFonts w:ascii="Tahoma" w:hAnsi="Tahoma" w:cs="Tahoma" w:eastAsia="Tahoma"/>
               </w:rPr>
-              <w:t xml:space="preserve">Purwo Setiawan</w:t>
+              <w:t xml:space="preserve">Purwo Setiawan, S.T., M.Sc</w:t>
             </w:r>
           </w:p>
         </w:tc>
@@ -1277,9 +1269,8 @@
             <w:r>
               <w:rPr>
                 <w:rFonts w:ascii="Tahoma" w:hAnsi="Tahoma" w:cs="Tahoma" w:eastAsia="Tahoma"/>
-                <w:highlight w:val="yellow"/>
-              </w:rPr>
-              <w:t xml:space="preserve">[NIDN/NUPTK]</w:t>
+              </w:rPr>
+              <w:t xml:space="preserve">0619019802</w:t>
             </w:r>
           </w:p>
         </w:tc>
@@ -1308,9 +1299,8 @@
             <w:r>
               <w:rPr>
                 <w:rFonts w:ascii="Tahoma" w:hAnsi="Tahoma" w:cs="Tahoma" w:eastAsia="Tahoma"/>
-                <w:highlight w:val="yellow"/>
-              </w:rPr>
-              <w:t xml:space="preserve">[Institusi]</w:t>
+              </w:rPr>
+              <w:t xml:space="preserve">Universitas Muhammadiyah Surakarta</w:t>
             </w:r>
           </w:p>
         </w:tc>
@@ -1377,7 +1367,7 @@
               <w:rPr>
                 <w:rFonts w:ascii="Tahoma" w:hAnsi="Tahoma" w:cs="Tahoma" w:eastAsia="Tahoma"/>
               </w:rPr>
-              <w:t xml:space="preserve">Ridwan Renaldi</w:t>
+              <w:t xml:space="preserve">Reza Amin Thohari, S.Kom.</w:t>
             </w:r>
           </w:p>
         </w:tc>
@@ -1406,9 +1396,8 @@
             <w:r>
               <w:rPr>
                 <w:rFonts w:ascii="Tahoma" w:hAnsi="Tahoma" w:cs="Tahoma" w:eastAsia="Tahoma"/>
-                <w:highlight w:val="yellow"/>
-              </w:rPr>
-              <w:t xml:space="preserve">[NIK]</w:t>
+              </w:rPr>
+              <w:t xml:space="preserve">L208269003</w:t>
             </w:r>
           </w:p>
         </w:tc>
@@ -1505,7 +1494,7 @@
               <w:rPr>
                 <w:rFonts w:ascii="Tahoma" w:hAnsi="Tahoma" w:cs="Tahoma" w:eastAsia="Tahoma"/>
               </w:rPr>
-              <w:t xml:space="preserve">Muhammad Hammam Islami</w:t>
+              <w:t xml:space="preserve">Ridwan Renaldi, S.Kom.</w:t>
             </w:r>
           </w:p>
         </w:tc>
@@ -1534,9 +1523,8 @@
             <w:r>
               <w:rPr>
                 <w:rFonts w:ascii="Tahoma" w:hAnsi="Tahoma" w:cs="Tahoma" w:eastAsia="Tahoma"/>
-                <w:highlight w:val="yellow"/>
-              </w:rPr>
-              <w:t xml:space="preserve">[NIK]</w:t>
+              </w:rPr>
+              <w:t xml:space="preserve">2011</w:t>
             </w:r>
           </w:p>
         </w:tc>
@@ -1565,9 +1553,8 @@
             <w:r>
               <w:rPr>
                 <w:rFonts w:ascii="Tahoma" w:hAnsi="Tahoma" w:cs="Tahoma" w:eastAsia="Tahoma"/>
-                <w:highlight w:val="yellow"/>
-              </w:rPr>
-              <w:t xml:space="preserve">[Institusi]</w:t>
+              </w:rPr>
+              <w:t xml:space="preserve">Universitas Muhammadiyah Surakarta</w:t>
             </w:r>
           </w:p>
         </w:tc>
@@ -1634,7 +1621,7 @@
               <w:rPr>
                 <w:rFonts w:ascii="Tahoma" w:hAnsi="Tahoma" w:cs="Tahoma" w:eastAsia="Tahoma"/>
               </w:rPr>
-              <w:t xml:space="preserve">Reza</w:t>
+              <w:t xml:space="preserve">Muhammad Hammam Islami, S.Kom</w:t>
             </w:r>
           </w:p>
         </w:tc>
@@ -1663,9 +1650,8 @@
             <w:r>
               <w:rPr>
                 <w:rFonts w:ascii="Tahoma" w:hAnsi="Tahoma" w:cs="Tahoma" w:eastAsia="Tahoma"/>
-                <w:highlight w:val="yellow"/>
-              </w:rPr>
-              <w:t xml:space="preserve">[NIM]</w:t>
+              </w:rPr>
+              <w:t xml:space="preserve">1996</w:t>
             </w:r>
           </w:p>
         </w:tc>
@@ -1694,9 +1680,8 @@
             <w:r>
               <w:rPr>
                 <w:rFonts w:ascii="Tahoma" w:hAnsi="Tahoma" w:cs="Tahoma" w:eastAsia="Tahoma"/>
-                <w:highlight w:val="yellow"/>
-              </w:rPr>
-              <w:t xml:space="preserve">[Institusi]</w:t>
+              </w:rPr>
+              <w:t xml:space="preserve">Universitas Muhammadiyah Surakarta</w:t>
             </w:r>
           </w:p>
         </w:tc>
@@ -1887,7 +1872,7 @@
               <w:rPr>
                 <w:rFonts w:ascii="Tahoma" w:hAnsi="Tahoma" w:cs="Tahoma" w:eastAsia="Tahoma"/>
               </w:rPr>
-              <w:t xml:space="preserve">Purwo Setiawan</w:t>
+              <w:t xml:space="preserve">Purwo Setiawan, S.T., M.Sc</w:t>
             </w:r>
           </w:p>
           <w:p>
@@ -1902,9 +1887,8 @@
             <w:r>
               <w:rPr>
                 <w:rFonts w:ascii="Tahoma" w:hAnsi="Tahoma" w:cs="Tahoma" w:eastAsia="Tahoma"/>
-                <w:highlight w:val="yellow"/>
-              </w:rPr>
-              <w:t xml:space="preserve">[NIDN/NUPTK]</w:t>
+              </w:rPr>
+              <w:t xml:space="preserve">0619019802</w:t>
             </w:r>
           </w:p>
         </w:tc>
@@ -2370,7 +2354,7 @@
               <w:rPr>
                 <w:rFonts w:ascii="Tahoma" w:hAnsi="Tahoma" w:cs="Tahoma" w:eastAsia="Tahoma"/>
               </w:rPr>
-              <w:t xml:space="preserve">SIGAP adalah satu aplikasi web monolit (Django dan PostgreSQL) dengan tampilan ponsel untuk sales dan panel komputer untuk pengguna kantor. Sales membuka daftar kunjungan hari ini yang diurutkan beserta alasannya (jatuh tempo, waktunya order menurut median selang pesanan, atau lama tidak dikunjungi), check-in (GPS dan jam), lalu menekan “Ulangi pesanan terakhir”. Pesanan disimpan dulu di peramban ponsel (IndexedDB [4]) dengan kode unik sesuai prinsip local-first [5], lalu dikirim otomatis saat ada sinyal; server menolak kode ganda sehingga pesanan tercatat tepat sekali. Stok dicatat sebagai stok fisik dan stok dipesan: pesanan langsung mengurangi stok tersedia (fisik − dipesan) dalam satu transaksi dengan penguncian baris [6] sehingga stok tidak pernah minus, dan stok fisik baru berkurang saat gudang mengonfirmasi pengiriman sehingga opname bebas selisih palsu. Barang masuk dicatat per batch dan kedaluwarsa; pengiriman memakai batch tertua (FEFO) dan mencatat outlet penerima tiap batch, sejalan dengan CPOTB [7]. Semua perubahan stok tercatat di riwayat mutasi. Dashboard direktur menampilkan performa sales, outlet paling aktif, perputaran stok, stok menipis, dan barang mendekati kedaluwarsa; data lama diimpor dari Excel dengan cek duplikat nomor HP. Kebaruannya adalah gabungan keempat fungsi itu (satu input untuk semua data, andal tanpa sinyal, stok fisik terpisah dari stok dipesan, telusur batch) dalam satu aplikasi ringan, bukan paket CRM/ERP yang terpisah per modul. Kelayakan: teknologi sumber terbuka yang matang, satu server, tanpa API berbayar. Nomor BPOM disimpan per produk [8]; data PIC outlet dilindungi hak akses per peran dan log sesuai UU PDP [9]. Dikembangkan tim, dapat di-hosting di Indonesia, dan didaftarkan sebagai hak cipta.</w:t>
+              <w:t xml:space="preserve">SIGAP adalah satu aplikasi web monolit (Django dan PostgreSQL) dengan tampilan ponsel untuk sales dan panel komputer untuk pengguna kantor. Sales membuka daftar kunjungan hari ini yang diurutkan beserta alasannya (jatuh tempo, waktunya order menurut median selang pesanan, atau lama tidak dikunjungi), check-in (GPS dan jam), lalu menekan “Ulangi pesanan terakhir”. Pesanan disimpan dulu di peramban ponsel (IndexedDB [4]) dengan kode unik sesuai prinsip local-first [5], lalu dikirim otomatis saat ada sinyal; server menolak kode ganda sehingga pesanan tercatat tepat sekali. Stok dicatat sebagai stok fisik dan stok dipesan: pesanan langsung mengurangi stok tersedia (fisik − dipesan) dalam satu transaksi dengan penguncian baris [6] sehingga stok tidak pernah minus, dan stok fisik baru berkurang saat gudang mengonfirmasi pengiriman sehingga opname bebas selisih palsu. Barang masuk dicatat per batch dan kedaluwarsa; pengiriman memakai batch tertua (FEFO) dan mencatat outlet penerima tiap batch, sejalan dengan CPOTB [7]. Semua perubahan stok tercatat di riwayat mutasi. Dashboard direktur menampilkan performa sales, outlet paling aktif, perputaran stok, stok menipis, barang mendekati kedaluwarsa, serta prediksi penjualan 4 minggu dan saran produksi; data lama diimpor dari Excel dengan cek duplikat nomor HP. Kebaruannya adalah gabungan keempat fungsi itu (satu input untuk semua data, andal tanpa sinyal, stok fisik terpisah dari stok dipesan, telusur batch) dalam satu aplikasi ringan, bukan paket CRM/ERP yang terpisah per modul. Kelayakan: teknologi sumber terbuka yang matang, satu server, tanpa API berbayar. Nomor BPOM disimpan per produk [8]; data PIC outlet dilindungi hak akses per peran dan log sesuai UU PDP [9]. Dikembangkan tim, dapat di-hosting di Indonesia, dan didaftarkan sebagai hak cipta.</w:t>
             </w:r>
           </w:p>
           <w:p>
@@ -2389,7 +2373,7 @@
               <w:rPr>
                 <w:rFonts w:ascii="Tahoma" w:hAnsi="Tahoma" w:cs="Tahoma" w:eastAsia="Tahoma"/>
               </w:rPr>
-              <w:t xml:space="preserve">Telah tersedia rancangan alur, arsitektur, data, dan layar, serta purwarupa Django–PostgreSQL yang lulus 19 dari 19 uji otomatis: pesanan tanpa sinyal tercatat tepat sekali, stok fisik terpisah dari stok dipesan, FEFO, dan stok tidak minus pada pesanan bersamaan (Lampiran C). Hak akses per peran, kunjungan hari ini, impor Excel, dan dashboard belum dibuat. TKT awal 3 (pembuktian konsep); target TKT 6 pada April 2027 melalui uji bersama sales dan admin mitra.</w:t>
+              <w:t xml:space="preserve">Telah tersedia rancangan alur, arsitektur, data, dan layar, serta purwarupa Django–PostgreSQL yang lulus 22 dari 22 uji otomatis: pesanan tanpa sinyal tercatat tepat sekali, stok fisik terpisah dari stok dipesan, FEFO, stok tidak minus pada pesanan bersamaan, dan prediksi penjualan yang pada data sintetis lebih akurat daripada ramalan naif (Lampiran C). Hak akses per peran, kunjungan hari ini, impor Excel, dan dashboard direktur lengkap belum dibuat. TKT awal 3 (pembuktian konsep); target TKT 6 pada April 2027 melalui uji bersama sales dan admin mitra.</w:t>
             </w:r>
           </w:p>
           <w:p>
@@ -2408,7 +2392,7 @@
               <w:rPr>
                 <w:rFonts w:ascii="Tahoma" w:hAnsi="Tahoma" w:cs="Tahoma" w:eastAsia="Tahoma"/>
               </w:rPr>
-              <w:t xml:space="preserve">Alokasi stok per sales dan peramalan permintaan menjadi rencana lanjutan setelah data riwayat cukup.</w:t>
+              <w:t xml:space="preserve">Prediksi penjualan per produk untuk saran produksi (exponential smoothing [10]) sudah berjalan di purwarupa dengan data sintetis; akurasinya pada data nyata diukur saat pilot (WAPE dibanding ramalan naif).</w:t>
             </w:r>
           </w:p>
           <w:tbl>
@@ -2646,7 +2630,7 @@
                       <w:rFonts w:ascii="Tahoma" w:hAnsi="Tahoma" w:cs="Tahoma" w:eastAsia="Tahoma"/>
                       <w:sz w:val="22"/>
                     </w:rPr>
-                    <w:t xml:space="preserve">≤15 detik; SUS ≥70 [10]</w:t>
+                    <w:t xml:space="preserve">≤15 detik; SUS ≥70 [11]</w:t>
                   </w:r>
                 </w:p>
               </w:tc>
@@ -3038,7 +3022,7 @@
                       <w:rFonts w:ascii="Tahoma" w:hAnsi="Tahoma" w:cs="Tahoma" w:eastAsia="Tahoma"/>
                       <w:sz w:val="22"/>
                     </w:rPr>
-                    <w:t xml:space="preserve">Ketua; operasional dan regulasi: koordinasi mitra, aturan stok, batch, FEFO, CPOTB, evaluasi</w:t>
+                    <w:t xml:space="preserve">Ketua; operasional dan regulasi: koordinasi mitra, aturan stok, batch, FEFO, CPOTB, peramalan, evaluasi</w:t>
                   </w:r>
                 </w:p>
               </w:tc>
@@ -3075,6 +3059,76 @@
                       <w:sz w:val="22"/>
                     </w:rPr>
                     <w:t xml:space="preserve">2</w:t>
+                  </w:r>
+                </w:p>
+              </w:tc>
+              <w:tc>
+                <w:tcPr>
+                  <w:tcW w:type="dxa" w:w="1750"/>
+                </w:tcPr>
+                <w:p>
+                  <w:pPr>
+                    <w:spacing w:before="0" w:after="0"/>
+                  </w:pPr>
+                  <w:r>
+                    <w:rPr>
+                      <w:rFonts w:ascii="Tahoma" w:hAnsi="Tahoma" w:cs="Tahoma" w:eastAsia="Tahoma"/>
+                      <w:sz w:val="22"/>
+                    </w:rPr>
+                    <w:t xml:space="preserve">Reza Amin Thohari</w:t>
+                  </w:r>
+                </w:p>
+              </w:tc>
+              <w:tc>
+                <w:tcPr>
+                  <w:tcW w:type="dxa" w:w="4700"/>
+                </w:tcPr>
+                <w:p>
+                  <w:pPr>
+                    <w:spacing w:before="0" w:after="0"/>
+                  </w:pPr>
+                  <w:r>
+                    <w:rPr>
+                      <w:rFonts w:ascii="Tahoma" w:hAnsi="Tahoma" w:cs="Tahoma" w:eastAsia="Tahoma"/>
+                      <w:sz w:val="22"/>
+                    </w:rPr>
+                    <w:t xml:space="preserve">Validasi pengguna: halaman sales, wawancara, uji tugas dan SUS, panduan pengguna</w:t>
+                  </w:r>
+                </w:p>
+              </w:tc>
+              <w:tc>
+                <w:tcPr>
+                  <w:tcW w:type="dxa" w:w="1800"/>
+                </w:tcPr>
+                <w:p>
+                  <w:pPr>
+                    <w:spacing w:before="0" w:after="0"/>
+                  </w:pPr>
+                  <w:r>
+                    <w:rPr>
+                      <w:rFonts w:ascii="Tahoma" w:hAnsi="Tahoma" w:cs="Tahoma" w:eastAsia="Tahoma"/>
+                      <w:sz w:val="22"/>
+                    </w:rPr>
+                    <w:t xml:space="preserve">Halaman sales, laporan uji</w:t>
+                  </w:r>
+                </w:p>
+              </w:tc>
+            </w:tr>
+            <w:tr>
+              <w:tc>
+                <w:tcPr>
+                  <w:tcW w:type="dxa" w:w="450"/>
+                </w:tcPr>
+                <w:p>
+                  <w:pPr>
+                    <w:spacing w:before="0" w:after="0"/>
+                  </w:pPr>
+                  <w:r>
+                    <w:rPr>
+                      <w:rFonts w:ascii="Tahoma" w:hAnsi="Tahoma" w:cs="Tahoma" w:eastAsia="Tahoma"/>
+                      <w:sz w:val="22"/>
+                    </w:rPr>
+                    <w:t xml:space="preserve">3</w:t>
                   </w:r>
                 </w:p>
               </w:tc>
@@ -3144,7 +3198,7 @@
                       <w:rFonts w:ascii="Tahoma" w:hAnsi="Tahoma" w:cs="Tahoma" w:eastAsia="Tahoma"/>
                       <w:sz w:val="22"/>
                     </w:rPr>
-                    <w:t xml:space="preserve">3</w:t>
+                    <w:t xml:space="preserve">4</w:t>
                   </w:r>
                 </w:p>
               </w:tc>
@@ -3200,76 +3254,6 @@
                 </w:p>
               </w:tc>
             </w:tr>
-            <w:tr>
-              <w:tc>
-                <w:tcPr>
-                  <w:tcW w:type="dxa" w:w="450"/>
-                </w:tcPr>
-                <w:p>
-                  <w:pPr>
-                    <w:spacing w:before="0" w:after="0"/>
-                  </w:pPr>
-                  <w:r>
-                    <w:rPr>
-                      <w:rFonts w:ascii="Tahoma" w:hAnsi="Tahoma" w:cs="Tahoma" w:eastAsia="Tahoma"/>
-                      <w:sz w:val="22"/>
-                    </w:rPr>
-                    <w:t xml:space="preserve">4</w:t>
-                  </w:r>
-                </w:p>
-              </w:tc>
-              <w:tc>
-                <w:tcPr>
-                  <w:tcW w:type="dxa" w:w="1750"/>
-                </w:tcPr>
-                <w:p>
-                  <w:pPr>
-                    <w:spacing w:before="0" w:after="0"/>
-                  </w:pPr>
-                  <w:r>
-                    <w:rPr>
-                      <w:rFonts w:ascii="Tahoma" w:hAnsi="Tahoma" w:cs="Tahoma" w:eastAsia="Tahoma"/>
-                      <w:sz w:val="22"/>
-                    </w:rPr>
-                    <w:t xml:space="preserve">Reza</w:t>
-                  </w:r>
-                </w:p>
-              </w:tc>
-              <w:tc>
-                <w:tcPr>
-                  <w:tcW w:type="dxa" w:w="4700"/>
-                </w:tcPr>
-                <w:p>
-                  <w:pPr>
-                    <w:spacing w:before="0" w:after="0"/>
-                  </w:pPr>
-                  <w:r>
-                    <w:rPr>
-                      <w:rFonts w:ascii="Tahoma" w:hAnsi="Tahoma" w:cs="Tahoma" w:eastAsia="Tahoma"/>
-                      <w:sz w:val="22"/>
-                    </w:rPr>
-                    <w:t xml:space="preserve">Validasi pengguna: halaman sales, wawancara, uji tugas dan SUS, panduan pengguna</w:t>
-                  </w:r>
-                </w:p>
-              </w:tc>
-              <w:tc>
-                <w:tcPr>
-                  <w:tcW w:type="dxa" w:w="1800"/>
-                </w:tcPr>
-                <w:p>
-                  <w:pPr>
-                    <w:spacing w:before="0" w:after="0"/>
-                  </w:pPr>
-                  <w:r>
-                    <w:rPr>
-                      <w:rFonts w:ascii="Tahoma" w:hAnsi="Tahoma" w:cs="Tahoma" w:eastAsia="Tahoma"/>
-                      <w:sz w:val="22"/>
-                    </w:rPr>
-                    <w:t xml:space="preserve">Halaman sales, laporan uji</w:t>
-                  </w:r>
-                </w:p>
-              </w:tc>
-            </w:tr>
           </w:tbl>
           <w:p>
             <w:pPr>
@@ -3481,6 +3465,20 @@
                 <w:rFonts w:ascii="Tahoma" w:hAnsi="Tahoma" w:cs="Tahoma" w:eastAsia="Tahoma"/>
               </w:rPr>
               <w:t>10.</w:t>
+              <w:tab/>
+              <w:t xml:space="preserve">Hyndman RJ, Athanasopoulos G. Forecasting: principles and practice. Ed. 3. Melbourne: OTexts; 2021. https://otexts.com/fpp3/</w:t>
+            </w:r>
+          </w:p>
+          <w:p>
+            <w:pPr>
+              <w:spacing w:before="0" w:after="0"/>
+              <w:ind w:left="360" w:hanging="360"/>
+            </w:pPr>
+            <w:r>
+              <w:rPr>
+                <w:rFonts w:ascii="Tahoma" w:hAnsi="Tahoma" w:cs="Tahoma" w:eastAsia="Tahoma"/>
+              </w:rPr>
+              <w:t>11.</w:t>
               <w:tab/>
               <w:t xml:space="preserve">Brooke J. SUS: a “quick and dirty” usability scale. Dalam: Usability Evaluation in Industry. Taylor &amp; Francis; 1996:189–194.</w:t>
             </w:r>
@@ -3781,7 +3779,7 @@
               <w:rPr>
                 <w:rFonts w:ascii="Tahoma" w:hAnsi="Tahoma" w:cs="Tahoma" w:eastAsia="Tahoma"/>
               </w:rPr>
-              <w:t xml:space="preserve">Purwo Setiawan</w:t>
+              <w:t xml:space="preserve">Purwo Setiawan, S.T., M.Sc</w:t>
             </w:r>
           </w:p>
         </w:tc>
@@ -3847,9 +3845,8 @@
             <w:r>
               <w:rPr>
                 <w:rFonts w:ascii="Tahoma" w:hAnsi="Tahoma" w:cs="Tahoma" w:eastAsia="Tahoma"/>
-                <w:highlight w:val="yellow"/>
-              </w:rPr>
-              <w:t xml:space="preserve">[NIDN/NUPTK]</w:t>
+              </w:rPr>
+              <w:t xml:space="preserve">0619019802</w:t>
             </w:r>
           </w:p>
         </w:tc>
@@ -3982,9 +3979,8 @@
             <w:r>
               <w:rPr>
                 <w:rFonts w:ascii="Tahoma" w:hAnsi="Tahoma" w:cs="Tahoma" w:eastAsia="Tahoma"/>
-                <w:highlight w:val="yellow"/>
-              </w:rPr>
-              <w:t xml:space="preserve">[Nama institusi]</w:t>
+              </w:rPr>
+              <w:t xml:space="preserve">Universitas Muhammadiyah Surakarta</w:t>
             </w:r>
           </w:p>
         </w:tc>
@@ -4635,7 +4631,7 @@
               <w:rPr>
                 <w:rFonts w:ascii="Tahoma" w:hAnsi="Tahoma" w:cs="Tahoma" w:eastAsia="Tahoma"/>
               </w:rPr>
-              <w:t xml:space="preserve">Purwo Setiawan</w:t>
+              <w:t xml:space="preserve">Purwo Setiawan, S.T., M.Sc</w:t>
             </w:r>
           </w:p>
         </w:tc>
@@ -4694,9 +4690,8 @@
             <w:r>
               <w:rPr>
                 <w:rFonts w:ascii="Tahoma" w:hAnsi="Tahoma" w:cs="Tahoma" w:eastAsia="Tahoma"/>
-                <w:highlight w:val="yellow"/>
-              </w:rPr>
-              <w:t xml:space="preserve">[NIDN/NUPTK]</w:t>
+              </w:rPr>
+              <w:t xml:space="preserve">0619019802</w:t>
             </w:r>
           </w:p>
         </w:tc>
@@ -4794,7 +4789,7 @@
               <w:rPr>
                 <w:rFonts w:ascii="Tahoma" w:hAnsi="Tahoma" w:cs="Tahoma" w:eastAsia="Tahoma"/>
               </w:rPr>
-              <w:t xml:space="preserve">Ridwan Renaldi</w:t>
+              <w:t xml:space="preserve">Reza Amin Thohari, S.Kom.</w:t>
             </w:r>
           </w:p>
         </w:tc>
@@ -4853,9 +4848,8 @@
             <w:r>
               <w:rPr>
                 <w:rFonts w:ascii="Tahoma" w:hAnsi="Tahoma" w:cs="Tahoma" w:eastAsia="Tahoma"/>
-                <w:highlight w:val="yellow"/>
-              </w:rPr>
-              <w:t xml:space="preserve">[NIK]</w:t>
+              </w:rPr>
+              <w:t xml:space="preserve">L208269003</w:t>
             </w:r>
           </w:p>
         </w:tc>
@@ -4953,7 +4947,7 @@
               <w:rPr>
                 <w:rFonts w:ascii="Tahoma" w:hAnsi="Tahoma" w:cs="Tahoma" w:eastAsia="Tahoma"/>
               </w:rPr>
-              <w:t xml:space="preserve">Muhammad Hammam Islami</w:t>
+              <w:t xml:space="preserve">Ridwan Renaldi, S.Kom.</w:t>
             </w:r>
           </w:p>
         </w:tc>
@@ -5012,9 +5006,8 @@
             <w:r>
               <w:rPr>
                 <w:rFonts w:ascii="Tahoma" w:hAnsi="Tahoma" w:cs="Tahoma" w:eastAsia="Tahoma"/>
-                <w:highlight w:val="yellow"/>
-              </w:rPr>
-              <w:t xml:space="preserve">[NIK]</w:t>
+              </w:rPr>
+              <w:t xml:space="preserve">2011</w:t>
             </w:r>
           </w:p>
         </w:tc>
@@ -5112,7 +5105,7 @@
               <w:rPr>
                 <w:rFonts w:ascii="Tahoma" w:hAnsi="Tahoma" w:cs="Tahoma" w:eastAsia="Tahoma"/>
               </w:rPr>
-              <w:t xml:space="preserve">Reza</w:t>
+              <w:t xml:space="preserve">Muhammad Hammam Islami, S.Kom</w:t>
             </w:r>
           </w:p>
         </w:tc>
@@ -5171,9 +5164,8 @@
             <w:r>
               <w:rPr>
                 <w:rFonts w:ascii="Tahoma" w:hAnsi="Tahoma" w:cs="Tahoma" w:eastAsia="Tahoma"/>
-                <w:highlight w:val="yellow"/>
-              </w:rPr>
-              <w:t xml:space="preserve">[NIM]</w:t>
+              </w:rPr>
+              <w:t xml:space="preserve">1996</w:t>
             </w:r>
           </w:p>
         </w:tc>
@@ -5261,7 +5253,7 @@
         <w:rPr>
           <w:rFonts w:ascii="Tahoma" w:hAnsi="Tahoma" w:cs="Tahoma" w:eastAsia="Tahoma"/>
         </w:rPr>
-        <w:t xml:space="preserve">konsep, rancangan sistem, dan purwarupa awal (kategori Awal). Purwarupa Django dan PostgreSQL sudah menjalankan pesanan tanpa sinyal yang tercatat tepat satu kali, pemisahan stok fisik dan dipesan, batch dengan FEFO, pembatalan, penyesuaian stok, dan telusur batch (C.5). Hak akses per peran, kunjungan hari ini, impor Excel, dan dashboard direktur belum dibuat (C.6). </w:t>
+        <w:t xml:space="preserve">konsep, rancangan sistem, dan purwarupa awal (kategori Awal). Purwarupa Django dan PostgreSQL sudah menjalankan pesanan tanpa sinyal yang tercatat tepat satu kali, pemisahan stok fisik dan dipesan, batch dengan FEFO, pembatalan, penyesuaian stok, telusur batch, serta prediksi penjualan dengan saran produksi (C.5). Hak akses per peran, kunjungan hari ini, impor Excel, dan dashboard direktur lengkap belum dibuat (C.6). </w:t>
       </w:r>
       <w:r>
         <w:rPr>
@@ -5274,7 +5266,7 @@
         <w:rPr>
           <w:rFonts w:ascii="Tahoma" w:hAnsi="Tahoma" w:cs="Tahoma" w:eastAsia="Tahoma"/>
         </w:rPr>
-        <w:t xml:space="preserve">rancangan tim berdasarkan brief tantangan ARB-02 dan paparan mitra; seluruh diagram dan kode dibuat oleh tim; purwarupa memakai Django, PostgreSQL, dan pustaka sumber terbuka Dexie.js dengan data contoh fiktif, bukan data mitra.</w:t>
+        <w:t xml:space="preserve">rancangan tim berdasarkan brief tantangan ARB-02 dan paparan mitra; seluruh diagram dan kode dibuat oleh tim; purwarupa memakai Django, PostgreSQL, dan pustaka sumber terbuka Dexie.js dengan data contoh fiktif; riwayat penjualan untuk prediksi adalah data sintetis, bukan data mitra.</w:t>
       </w:r>
     </w:p>
     <w:p>
@@ -6766,7 +6758,7 @@
                 <w:rFonts w:ascii="Tahoma" w:hAnsi="Tahoma" w:cs="Tahoma" w:eastAsia="Tahoma"/>
                 <w:sz w:val="20"/>
               </w:rPr>
-              <w:t xml:space="preserve">Performa sales, outlet paling aktif, perputaran stok, stok menipis, barang mendekati kedaluwarsa</w:t>
+              <w:t xml:space="preserve">Performa sales, outlet paling aktif, perputaran stok, stok menipis, barang mendekati kedaluwarsa, prediksi penjualan 4 minggu dan saran produksi</w:t>
             </w:r>
           </w:p>
         </w:tc>
@@ -7170,6 +7162,42 @@
           </w:p>
         </w:tc>
       </w:tr>
+      <w:tr>
+        <w:tc>
+          <w:tcPr>
+            <w:tcW w:type="dxa" w:w="2200"/>
+          </w:tcPr>
+          <w:p>
+            <w:pPr>
+              <w:spacing w:before="0" w:after="0"/>
+            </w:pPr>
+            <w:r>
+              <w:rPr>
+                <w:rFonts w:ascii="Tahoma" w:hAnsi="Tahoma" w:cs="Tahoma" w:eastAsia="Tahoma"/>
+                <w:sz w:val="20"/>
+              </w:rPr>
+              <w:t xml:space="preserve">permintaan_mingguan</w:t>
+            </w:r>
+          </w:p>
+        </w:tc>
+        <w:tc>
+          <w:tcPr>
+            <w:tcW w:type="dxa" w:w="6800"/>
+          </w:tcPr>
+          <w:p>
+            <w:pPr>
+              <w:spacing w:before="0" w:after="0"/>
+            </w:pPr>
+            <w:r>
+              <w:rPr>
+                <w:rFonts w:ascii="Tahoma" w:hAnsi="Tahoma" w:cs="Tahoma" w:eastAsia="Tahoma"/>
+                <w:sz w:val="20"/>
+              </w:rPr>
+              <w:t xml:space="preserve">Produk, minggu, jumlah, sumber (impor rekap Excel atau data sintetis); dasar prediksi penjualan</w:t>
+            </w:r>
+          </w:p>
+        </w:tc>
+      </w:tr>
     </w:tbl>
     <w:p>
       <w:pPr>
@@ -7233,7 +7261,7 @@
         <w:rPr>
           <w:rFonts w:ascii="Tahoma" w:hAnsi="Tahoma" w:cs="Tahoma" w:eastAsia="Tahoma"/>
         </w:rPr>
-        <w:t xml:space="preserve">. Uji otomatis dijalankan di Google Chrome dengan tampilan ponsel pada 19 Oktober 2026 (Python 3.12, Django 6.0, PostgreSQL 16). Koneksi diputus selama ±10 detik melalui emulasi jaringan, setara mode pesawat, lalu dinyalakan kembali. Hasilnya 19 dari 19 pemeriksaan lulus (Tabel C.5), mencakup mode tanpa sinyal, pemisahan stok fisik dan dipesan, FEFO, pembatalan, opname, dua pesanan bersamaan, dan telusur batch.</w:t>
+        <w:t xml:space="preserve">. Uji otomatis dijalankan di Google Chrome dengan tampilan ponsel pada 20 Oktober 2026 (Python 3.12, Django 6.0, PostgreSQL 16). Koneksi diputus selama ±10 detik melalui emulasi jaringan, setara mode pesawat, lalu dinyalakan kembali. Hasilnya 22 dari 22 pemeriksaan lulus (Tabel C.5), mencakup mode tanpa sinyal, pemisahan stok fisik dan dipesan, FEFO, pembatalan, opname, dua pesanan bersamaan, telusur batch, dan prediksi penjualan. Prediksi memakai riwayat permintaan 26 minggu berupa data sintetis; 4 minggu terakhir disisihkan untuk mengukur akurasi (Gambar C.5d).</w:t>
       </w:r>
     </w:p>
     <w:p>
@@ -7404,7 +7432,47 @@
     <w:p>
       <w:pPr>
         <w:keepNext/>
-        <w:spacing w:before="0" w:after="60"/>
+        <w:spacing w:before="0" w:after="40"/>
+        <w:jc w:val="center"/>
+      </w:pPr>
+      <w:r>
+        <w:drawing>
+          <wp:inline>
+            <wp:extent cx="5724000" cy="3542311"/>
+            <wp:docPr id="8" name="Picture 8"/>
+            <wp:cNvGraphicFramePr>
+              <a:graphicFrameLocks noChangeAspect="1"/>
+            </wp:cNvGraphicFramePr>
+            <a:graphic>
+              <a:graphicData uri="http://schemas.openxmlformats.org/drawingml/2006/picture">
+                <pic:pic>
+                  <pic:nvPicPr>
+                    <pic:cNvPr id="0" name="C5d_prediksi_penjualan.png"/>
+                    <pic:cNvPicPr/>
+                  </pic:nvPicPr>
+                  <pic:blipFill>
+                    <a:blip r:embed="rIdC5d"/>
+                    <a:stretch>
+                      <a:fillRect/>
+                    </a:stretch>
+                  </pic:blipFill>
+                  <pic:spPr>
+                    <a:xfrm>
+                      <a:off x="0" y="0"/>
+                      <a:ext cx="5724000" cy="3542311"/>
+                    </a:xfrm>
+                    <a:prstGeom prst="rect"/>
+                  </pic:spPr>
+                </pic:pic>
+              </a:graphicData>
+            </a:graphic>
+          </wp:inline>
+        </w:drawing>
+      </w:r>
+    </w:p>
+    <w:p>
+      <w:pPr>
+        <w:spacing w:before="0" w:after="200"/>
         <w:jc w:val="center"/>
       </w:pPr>
       <w:r>
@@ -7413,7 +7481,22 @@
           <w:i/>
           <w:sz w:val="18"/>
         </w:rPr>
-        <w:t xml:space="preserve">Tabel C.5. Hasil uji otomatis purwarupa (Chrome tampilan ponsel; Django 6.0 dan PostgreSQL 16; 19 Oktober 2026): 19 dari 19 lulus</w:t>
+        <w:t xml:space="preserve">Gambar C.5d. Prediksi penjualan di panel uji: riwayat permintaan 26 minggu (data sintetis) dan ramalan 4 minggu dengan exponential smoothing; tabel menampilkan stok cukup untuk berapa hari, saran produksi (perkiraan 4 minggu + stok minimum − stok tersedia), dan WAPE pada 4 minggu uji. WAPE gabungan model 23,0% dibanding ramalan naif 28,7%; model lebih akurat pada 4 dari 5 produk.</w:t>
+      </w:r>
+    </w:p>
+    <w:p>
+      <w:pPr>
+        <w:keepNext/>
+        <w:spacing w:before="0" w:after="60"/>
+        <w:jc w:val="center"/>
+      </w:pPr>
+      <w:r>
+        <w:rPr>
+          <w:rFonts w:ascii="Tahoma" w:hAnsi="Tahoma" w:cs="Tahoma" w:eastAsia="Tahoma"/>
+          <w:i/>
+          <w:sz w:val="18"/>
+        </w:rPr>
+        <w:t xml:space="preserve">Tabel C.5. Hasil uji otomatis purwarupa (Chrome tampilan ponsel; Django 6.0 dan PostgreSQL 16; 20 Oktober 2026): 22 dari 22 lulus</w:t>
       </w:r>
     </w:p>
     <w:tbl>
@@ -8504,6 +8587,165 @@
           </w:p>
         </w:tc>
       </w:tr>
+      <w:tr>
+        <w:tc>
+          <w:tcPr>
+            <w:tcW w:type="dxa" w:w="450"/>
+          </w:tcPr>
+          <w:p>
+            <w:pPr>
+              <w:spacing w:before="0" w:after="0"/>
+            </w:pPr>
+            <w:r>
+              <w:rPr>
+                <w:rFonts w:ascii="Tahoma" w:hAnsi="Tahoma" w:cs="Tahoma" w:eastAsia="Tahoma"/>
+                <w:sz w:val="20"/>
+              </w:rPr>
+              <w:t xml:space="preserve">20</w:t>
+            </w:r>
+          </w:p>
+        </w:tc>
+        <w:tc>
+          <w:tcPr>
+            <w:tcW w:type="dxa" w:w="7750"/>
+          </w:tcPr>
+          <w:p>
+            <w:pPr>
+              <w:spacing w:before="0" w:after="0"/>
+            </w:pPr>
+            <w:r>
+              <w:rPr>
+                <w:rFonts w:ascii="Tahoma" w:hAnsi="Tahoma" w:cs="Tahoma" w:eastAsia="Tahoma"/>
+                <w:sz w:val="20"/>
+              </w:rPr>
+              <w:t xml:space="preserve">Prediksi penjualan tersedia untuk 5 produk: ramalan 4 minggu dan saran produksi sesuai rumus</w:t>
+            </w:r>
+          </w:p>
+        </w:tc>
+        <w:tc>
+          <w:tcPr>
+            <w:tcW w:type="dxa" w:w="800"/>
+          </w:tcPr>
+          <w:p>
+            <w:pPr>
+              <w:spacing w:before="0" w:after="0"/>
+            </w:pPr>
+            <w:r>
+              <w:rPr>
+                <w:rFonts w:ascii="Tahoma" w:hAnsi="Tahoma" w:cs="Tahoma" w:eastAsia="Tahoma"/>
+                <w:sz w:val="20"/>
+              </w:rPr>
+              <w:t xml:space="preserve">Lulus</w:t>
+            </w:r>
+          </w:p>
+        </w:tc>
+      </w:tr>
+      <w:tr>
+        <w:tc>
+          <w:tcPr>
+            <w:tcW w:type="dxa" w:w="450"/>
+          </w:tcPr>
+          <w:p>
+            <w:pPr>
+              <w:spacing w:before="0" w:after="0"/>
+            </w:pPr>
+            <w:r>
+              <w:rPr>
+                <w:rFonts w:ascii="Tahoma" w:hAnsi="Tahoma" w:cs="Tahoma" w:eastAsia="Tahoma"/>
+                <w:sz w:val="20"/>
+              </w:rPr>
+              <w:t xml:space="preserve">21</w:t>
+            </w:r>
+          </w:p>
+        </w:tc>
+        <w:tc>
+          <w:tcPr>
+            <w:tcW w:type="dxa" w:w="7750"/>
+          </w:tcPr>
+          <w:p>
+            <w:pPr>
+              <w:spacing w:before="0" w:after="0"/>
+            </w:pPr>
+            <w:r>
+              <w:rPr>
+                <w:rFonts w:ascii="Tahoma" w:hAnsi="Tahoma" w:cs="Tahoma" w:eastAsia="Tahoma"/>
+                <w:sz w:val="20"/>
+              </w:rPr>
+              <w:t xml:space="preserve">Permintaan minggu berjalan menghitung baris yang ditolak (Kapsul 3 + 15 = 18) dan mengabaikan pesanan batal</w:t>
+            </w:r>
+          </w:p>
+        </w:tc>
+        <w:tc>
+          <w:tcPr>
+            <w:tcW w:type="dxa" w:w="800"/>
+          </w:tcPr>
+          <w:p>
+            <w:pPr>
+              <w:spacing w:before="0" w:after="0"/>
+            </w:pPr>
+            <w:r>
+              <w:rPr>
+                <w:rFonts w:ascii="Tahoma" w:hAnsi="Tahoma" w:cs="Tahoma" w:eastAsia="Tahoma"/>
+                <w:sz w:val="20"/>
+              </w:rPr>
+              <w:t xml:space="preserve">Lulus</w:t>
+            </w:r>
+          </w:p>
+        </w:tc>
+      </w:tr>
+      <w:tr>
+        <w:tc>
+          <w:tcPr>
+            <w:tcW w:type="dxa" w:w="450"/>
+          </w:tcPr>
+          <w:p>
+            <w:pPr>
+              <w:spacing w:before="0" w:after="0"/>
+            </w:pPr>
+            <w:r>
+              <w:rPr>
+                <w:rFonts w:ascii="Tahoma" w:hAnsi="Tahoma" w:cs="Tahoma" w:eastAsia="Tahoma"/>
+                <w:sz w:val="20"/>
+              </w:rPr>
+              <w:t xml:space="preserve">22</w:t>
+            </w:r>
+          </w:p>
+        </w:tc>
+        <w:tc>
+          <w:tcPr>
+            <w:tcW w:type="dxa" w:w="7750"/>
+          </w:tcPr>
+          <w:p>
+            <w:pPr>
+              <w:spacing w:before="0" w:after="0"/>
+            </w:pPr>
+            <w:r>
+              <w:rPr>
+                <w:rFonts w:ascii="Tahoma" w:hAnsi="Tahoma" w:cs="Tahoma" w:eastAsia="Tahoma"/>
+                <w:sz w:val="20"/>
+              </w:rPr>
+              <w:t xml:space="preserve">Pada 4 minggu uji (data sintetis), WAPE gabungan model 23,0% lebih kecil daripada ramalan naif 28,7%</w:t>
+            </w:r>
+          </w:p>
+        </w:tc>
+        <w:tc>
+          <w:tcPr>
+            <w:tcW w:type="dxa" w:w="800"/>
+          </w:tcPr>
+          <w:p>
+            <w:pPr>
+              <w:spacing w:before="0" w:after="0"/>
+            </w:pPr>
+            <w:r>
+              <w:rPr>
+                <w:rFonts w:ascii="Tahoma" w:hAnsi="Tahoma" w:cs="Tahoma" w:eastAsia="Tahoma"/>
+                <w:sz w:val="20"/>
+              </w:rPr>
+              <w:t xml:space="preserve">Lulus</w:t>
+            </w:r>
+          </w:p>
+        </w:tc>
+      </w:tr>
     </w:tbl>
     <w:p>
       <w:pPr>
@@ -8640,7 +8882,7 @@
                 <w:rFonts w:ascii="Tahoma" w:hAnsi="Tahoma" w:cs="Tahoma" w:eastAsia="Tahoma"/>
                 <w:sz w:val="20"/>
               </w:rPr>
-              <w:t xml:space="preserve">20</w:t>
+              <w:t xml:space="preserve">23</w:t>
             </w:r>
           </w:p>
         </w:tc>
@@ -8693,7 +8935,7 @@
                 <w:rFonts w:ascii="Tahoma" w:hAnsi="Tahoma" w:cs="Tahoma" w:eastAsia="Tahoma"/>
                 <w:sz w:val="20"/>
               </w:rPr>
-              <w:t xml:space="preserve">21</w:t>
+              <w:t xml:space="preserve">24</w:t>
             </w:r>
           </w:p>
         </w:tc>
@@ -8746,7 +8988,7 @@
                 <w:rFonts w:ascii="Tahoma" w:hAnsi="Tahoma" w:cs="Tahoma" w:eastAsia="Tahoma"/>
                 <w:sz w:val="20"/>
               </w:rPr>
-              <w:t xml:space="preserve">22</w:t>
+              <w:t xml:space="preserve">25</w:t>
             </w:r>
           </w:p>
         </w:tc>
@@ -8799,7 +9041,7 @@
                 <w:rFonts w:ascii="Tahoma" w:hAnsi="Tahoma" w:cs="Tahoma" w:eastAsia="Tahoma"/>
                 <w:sz w:val="20"/>
               </w:rPr>
-              <w:t xml:space="preserve">23</w:t>
+              <w:t xml:space="preserve">26</w:t>
             </w:r>
           </w:p>
         </w:tc>
@@ -8852,7 +9094,7 @@
                 <w:rFonts w:ascii="Tahoma" w:hAnsi="Tahoma" w:cs="Tahoma" w:eastAsia="Tahoma"/>
                 <w:sz w:val="20"/>
               </w:rPr>
-              <w:t xml:space="preserve">24</w:t>
+              <w:t xml:space="preserve">27</w:t>
             </w:r>
           </w:p>
         </w:tc>

</xml_diff>